<commit_message>
feat(dvr): pagine del modulo DVR e redazione del DVR Rumore
- /cantieri/:id/dvr: anagrafica, ambiti, mansioni con conferma e storico, DPI, macchine, tarature, documenti
- /cantieri/:id/dvr/:docId: dati documento, matrice dei tempi con calcolo in tempo reale, testi, revisioni, generazione Word
- E2E con Supabase finto in memoria (nessun database toccato)
- docs/DVR.md e CLAUDE.md aggiornati

Co-Authored-By: Claude Opus 5.5 <noreply@anthropic.com>
Claude-Session: https://claude.ai/code/session_01UFrHEpZ45TUB6Ew485d3AX
</commit_message>
<xml_diff>
--- a/public/templates/dvr/rumore.docx
+++ b/public/templates/dvr/rumore.docx
@@ -69,7 +69,7 @@
                   <o:lock v:ext="edit" aspectratio="t"/>
                 </v:shapetype>
                 <v:shape id="Immagine 1" o:spid="_x0000_s2142" type="#_x0000_t75" style="position:absolute;left:0;text-align:left;margin-left:.1pt;margin-top:11.85pt;width:198.45pt;height:52.6pt;z-index:251659264;visibility:visible;mso-wrap-style:square;mso-position-horizontal-relative:text;mso-position-vertical-relative:line;mso-width-relative:page;mso-height-relative:page">
-                  <v:imagedata r:id="rId8" o:title="" croptop="25334f" cropbottom="22809f" cropleft="10193f" cropright="8926f"/>
+                  <v:imagedata r:id="rId8" o:title=""/>
                   <w10:wrap type="topAndBottom"/>
                 </v:shape>
               </w:pict>
@@ -21319,7 +21319,7 @@
           <o:lock v:ext="edit" aspectratio="t"/>
         </v:shapetype>
         <v:shape id="Immagine 1" o:spid="_x0000_s1034" type="#_x0000_t75" style="position:absolute;margin-left:288.1pt;margin-top:-6.45pt;width:198.45pt;height:52.6pt;z-index:251658240;visibility:visible;mso-wrap-style:square;mso-position-horizontal-relative:text;mso-position-vertical-relative:line;mso-width-relative:page;mso-height-relative:page">
-          <v:imagedata r:id="rId1" o:title="" croptop="25334f" cropbottom="22809f" cropleft="10193f" cropright="8926f"/>
+          <v:imagedata r:id="rId1" o:title=""/>
           <w10:wrap type="square"/>
         </v:shape>
       </w:pict>
@@ -21420,8 +21420,8 @@
           <v:path o:extrusionok="f" gradientshapeok="t" o:connecttype="rect"/>
           <o:lock v:ext="edit" aspectratio="t"/>
         </v:shapetype>
-        <v:shape id="_x0000_s1030" type="#_x0000_t75" alt="Case History - Smartnebula" style="position:absolute;margin-left:343.05pt;margin-top:-9.25pt;width:150.8pt;height:69.75pt;z-index:251657216;visibility:visible;mso-width-relative:margin;mso-height-relative:margin">
-          <v:imagedata r:id="rId1" o:title="Case History - Smartnebula"/>
+        <v:shape id="_x0000_s1030" type="#_x0000_t75" alt="Case History - Smartnebula" style="position:absolute;margin-left:343.05pt;margin-top:-9.25pt;width:198.45pt;height:52.6pt;z-index:251657216;visibility:visible;mso-width-relative:margin;mso-height-relative:margin">
+          <v:imagedata r:id="rId1" o:title=""/>
         </v:shape>
       </w:pict>
     </w:r>

</xml_diff>

<commit_message>
feat(dvr): testi predefiniti secondo gli ambiti (gallerie, viadotti, opere in esterno, piazzale, officina)
Ciclo di lavoro con un blocco per ogni tipo di ambito del documento, zonizzazione del rumore anche
all'aperto, luoghi di lavoro nel DVR Rumore al posto di "TBM1 e piazzale antistante" del modello.

Co-Authored-By: Claude Opus 5.5 <noreply@anthropic.com>
Claude-Session: https://claude.ai/code/session_01UFrHEpZ45TUB6Ew485d3AX
</commit_message>
<xml_diff>
--- a/public/templates/dvr/rumore.docx
+++ b/public/templates/dvr/rumore.docx
@@ -5000,7 +5000,7 @@
         <w:jc w:val="both"/>
       </w:pPr>
       <w:r>
-        <w:t>Zonizzazione del rumore in galleria.</w:t>
+        <w:t xml:space="preserve">Zonizzazione del rumore.</w:t>
       </w:r>
     </w:p>
     <w:p>
@@ -7050,7 +7050,7 @@
           <w:b w:val="0"/>
           <w:sz w:val="20"/>
         </w:rPr>
-        <w:t>Sulla base delle informazioni acquisite e dei sopralluoghi effettuati in cantiere per verificare ambiente e metodi di lavoro e dell’esperienza di rilievi di rumore effettuati in cantieri simili, è stato possibile caratterizzare il rumore cui sono esposti i lavoratori operanti sul</w:t>
+        <w:t xml:space="preserve">Sulla base delle informazioni acquisite e dei sopralluoghi effettuati in cantiere per verificare ambiente e metodi di lavoro e dell’esperienza di rilievi di rumore effettuati in cantieri simili, è stato possibile caratterizzare il rumore cui sono esposti i lavoratori operanti {luoghiLavoro}.</w:t>
       </w:r>
       <w:r>
         <w:rPr>
@@ -7058,7 +7058,7 @@
           <w:b w:val="0"/>
           <w:sz w:val="20"/>
         </w:rPr>
-        <w:t>la TBM1 e sul piazzale antistante</w:t>
+        <w:t/>
       </w:r>
       <w:r>
         <w:rPr>
@@ -7066,7 +7066,7 @@
           <w:b w:val="0"/>
           <w:sz w:val="20"/>
         </w:rPr>
-        <w:t>.</w:t>
+        <w:t/>
       </w:r>
     </w:p>
     <w:p/>
@@ -12229,7 +12229,7 @@
         <w:pStyle w:val="Corpotesto1"/>
       </w:pPr>
       <w:r>
-        <w:t>I livelli di esposizione personale al rumore sono stati determinati elaborando i risultati delle misure fonometriche effettuate durante le principali fasi lavorative svolte in galleria e nelle aree esterne di cantiere.</w:t>
+        <w:t xml:space="preserve">I livelli di esposizione personale al rumore sono stati determinati elaborando i risultati delle misure fonometriche effettuate durante le principali fasi lavorative svolte {luoghiLavoro}.</w:t>
       </w:r>
     </w:p>
     <w:p>

</xml_diff>